<commit_message>
Replace long dashes with hyphens across v2 deliverables
Sanitize em dash, en dash and minus sign to hyphen in all three v2
files (deck, xlsx, doc); reword '->20%' style strings to 'drops >20%'.

https://claude.ai/code/session_01NksSqrSqDgtmZbhunqjgZD
</commit_message>
<xml_diff>
--- a/outputs/touchretouch-testtask/v2/TouchRetouch_Experiments_Measurement.docx
+++ b/outputs/touchretouch-testtask/v2/TouchRetouch_Experiments_Measurement.docx
@@ -10,7 +10,7 @@
           <w:color w:val="C8542F"/>
           <w:sz w:val="34"/>
         </w:rPr>
-        <w:t>TouchRetouch — Experiment Briefs &amp; Measurement Plan</w:t>
+        <w:t>TouchRetouch - Experiment Briefs &amp; Measurement Plan</w:t>
       </w:r>
     </w:p>
     <w:p>
@@ -73,7 +73,7 @@
         <w:t xml:space="preserve">Caveat: </w:t>
       </w:r>
       <w:r>
-        <w:t>real cash by day 30 is a fraction of Y1 — the 'D30 cash ROAS' column stays informational until we replace 0.45 with RevenueCat's real D30/Y1 curve.</w:t>
+        <w:t>real cash by day 30 is a fraction of Y1 - the 'D30 cash ROAS' column stays informational until we replace 0.45 with RevenueCat's real D30/Y1 curve.</w:t>
       </w:r>
     </w:p>
     <w:p>
@@ -84,7 +84,7 @@
           <w:color w:val="C8542F"/>
           <w:sz w:val="34"/>
         </w:rPr>
-        <w:t>Part A — Experiment backlog (prioritised)</w:t>
+        <w:t>Part A - Experiment backlog (prioritised)</w:t>
       </w:r>
     </w:p>
     <w:p>
@@ -119,7 +119,7 @@
         <w:t xml:space="preserve">Hypothesis: </w:t>
       </w:r>
       <w:r>
-        <w:t>Brand is 58% of spend with max bids €25–35 vs €1.2–1.9 real. Someone searching 'TouchRetouch' already wants us, so most of this pays for installs organic wins for free. I want to prove how much brand paid spend is actually incremental before I redeploy it.</w:t>
+        <w:t>Brand is 58% of spend with max bids €25-35 vs €1.2-1.9 real. Someone searching 'TouchRetouch' already wants us, so most of this pays for installs organic wins for free. I want to prove how much brand paid spend is actually incremental before I redeploy it.</w:t>
       </w:r>
     </w:p>
     <w:p>
@@ -133,7 +133,7 @@
         <w:t xml:space="preserve">Design: </w:t>
       </w:r>
       <w:r>
-        <w:t>Cap brand CPT to €3–5. Then pause brand for 1–2 weeks and measure how many lost paid brand installs organic recovers. Clean before/after window; watch for competitors bidding our brand.</w:t>
+        <w:t>Cap brand CPT to €3-5. Then pause brand for 1-2 weeks and measure how many lost paid brand installs organic recovers. Clean before/after window; watch for competitors bidding our brand.</w:t>
       </w:r>
     </w:p>
     <w:p>
@@ -242,7 +242,7 @@
         <w:t xml:space="preserve">Min runtime: </w:t>
       </w:r>
       <w:r>
-        <w:t>3–4 weeks (SKAN lag).</w:t>
+        <w:t>3-4 weeks (SKAN lag).</w:t>
       </w:r>
     </w:p>
     <w:p>
@@ -323,7 +323,7 @@
         <w:t xml:space="preserve">Min runtime: </w:t>
       </w:r>
       <w:r>
-        <w:t>3–4 weeks.</w:t>
+        <w:t>3-4 weeks.</w:t>
       </w:r>
     </w:p>
     <w:p>
@@ -337,7 +337,7 @@
         <w:t xml:space="preserve">Success / Kill: </w:t>
       </w:r>
       <w:r>
-        <w:t>SUCCESS: generic CPA −15% at equal or higher volume → permanent. KILL: volume −&gt;20% with no CPA gain → rebalance.</w:t>
+        <w:t>SUCCESS: generic CPA -15% at equal or higher volume → permanent. KILL: volume drops &gt;20% with no CPA gain → rebalance.</w:t>
       </w:r>
     </w:p>
     <w:p>
@@ -362,7 +362,7 @@
         <w:t xml:space="preserve">Hypothesis: </w:t>
       </w:r>
       <w:r>
-        <w:t>Our real competitor is increasingly ChatGPT/Gemini — some users open an LLM to edit a photo instead of finding a retoucher. If we position TouchRetouch as a purpose-built tool that does these exact jobs better than a general AI, we can capture that intent.</w:t>
+        <w:t>Our real competitor is increasingly ChatGPT/Gemini - some users open an LLM to edit a photo instead of finding a retoucher. If we position TouchRetouch as a purpose-built tool that does these exact jobs better than a general AI, we can capture that intent.</w:t>
       </w:r>
     </w:p>
     <w:p>
@@ -376,7 +376,7 @@
         <w:t xml:space="preserve">Design: </w:t>
       </w:r>
       <w:r>
-        <w:t>Ship an AI-angle CPP ('AI, done right' — result-vs-prompt, sharper output) with 'AI' badges on the lead screenshots, served to ai-intent terms (ai photo editor, ai object remover). Compare against the default page and the plain tool CPP.</w:t>
+        <w:t>Ship an AI-angle CPP ('AI, done right' - result-vs-prompt, sharper output) with 'AI' badges on the lead screenshots, served to ai-intent terms (ai photo editor, ai object remover). Compare against the default page and the plain tool CPP.</w:t>
       </w:r>
     </w:p>
     <w:p>
@@ -404,7 +404,7 @@
         <w:t xml:space="preserve">Min runtime: </w:t>
       </w:r>
       <w:r>
-        <w:t>2–3 weeks or ~9,000 impressions/variant.</w:t>
+        <w:t>2-3 weeks or ~9,000 impressions/variant.</w:t>
       </w:r>
     </w:p>
     <w:p>
@@ -443,7 +443,7 @@
         <w:t xml:space="preserve">Hypothesis: </w:t>
       </w:r>
       <w:r>
-        <w:t>Competitor runs only on Product Pages at CPA €17 and TTR 2%. Users rarely scroll a rival's page to switch, our screens don't stand out there, and it barely brings installs — so it doesn't even feed organic. I expect it's pure waste, but I'll confirm with data before cutting.</w:t>
+        <w:t>Competitor runs only on Product Pages at CPA €17 and TTR 2%. Users rarely scroll a rival's page to switch, our screens don't stand out there, and it barely brings installs - so it doesn't even feed organic. I expect it's pure waste, but I'll confirm with data before cutting.</w:t>
       </w:r>
     </w:p>
     <w:p>
@@ -566,7 +566,7 @@
         <w:t xml:space="preserve">Min runtime: </w:t>
       </w:r>
       <w:r>
-        <w:t>2–3 weeks.</w:t>
+        <w:t>2-3 weeks.</w:t>
       </w:r>
     </w:p>
     <w:p>
@@ -584,9 +584,7 @@
       </w:r>
     </w:p>
     <w:p>
-      <w:r>
-        <w:br w:type="page"/>
-      </w:r>
+      <w:r/>
     </w:p>
     <w:p>
       <w:r>
@@ -596,7 +594,7 @@
           <w:color w:val="C8542F"/>
           <w:sz w:val="34"/>
         </w:rPr>
-        <w:t>Part B — Measurement &amp; attribution plan</w:t>
+        <w:t>Part B - Measurement &amp; attribution plan</w:t>
       </w:r>
     </w:p>
     <w:p>
@@ -607,7 +605,7 @@
           <w:color w:val="23303B"/>
           <w:sz w:val="25"/>
         </w:rPr>
-        <w:t>B.1 — The 30% console-vs-MMP install gap</w:t>
+        <w:t>B.1 - The 30% console-vs-MMP install gap</w:t>
       </w:r>
     </w:p>
     <w:p>
@@ -645,7 +643,7 @@
         <w:t xml:space="preserve">Under-counting: </w:t>
       </w:r>
       <w:r>
-        <w:t>AppsFlyer dedupes, uses its own window, and only counts installs where its SDK fires on first open — so ATT-declined / SKAN-null / delayed-postback installs and uninstalled-before-open users drop out.</w:t>
+        <w:t>AppsFlyer dedupes, uses its own window, and only counts installs where its SDK fires on first open - so ATT-declined / SKAN-null / delayed-postback installs and uninstalled-before-open users drop out.</w:t>
       </w:r>
     </w:p>
     <w:p>
@@ -670,7 +668,7 @@
           <w:color w:val="23303B"/>
           <w:sz w:val="25"/>
         </w:rPr>
-        <w:t>B.2 — How I reconcile</w:t>
+        <w:t>B.2 - How I reconcile</w:t>
       </w:r>
     </w:p>
     <w:p>
@@ -686,7 +684,7 @@
         <w:pStyle w:val="ListBullet"/>
       </w:pPr>
       <w:r>
-        <w:t>use the AdServices API as source of truth for ASA installs — deterministic and survives ATT because Apple owns both the store and the ad network.</w:t>
+        <w:t>use the AdServices API as source of truth for ASA installs - deterministic and survives ATT because Apple owns both the store and the ad network.</w:t>
       </w:r>
     </w:p>
     <w:p>
@@ -694,7 +692,7 @@
         <w:pStyle w:val="ListBullet"/>
       </w:pPr>
       <w:r>
-        <w:t>build a documented weekly bridge: console installs − redownloads − ATT/SKAN-null ≈ MMP. Track the residual %; a sudden change flags a tracking break, not a performance change.</w:t>
+        <w:t>build a documented weekly bridge: console installs - redownloads - ATT/SKAN-null ≈ MMP. Track the residual %; a sudden change flags a tracking break, not a performance change.</w:t>
       </w:r>
     </w:p>
     <w:p>
@@ -705,7 +703,7 @@
           <w:color w:val="23303B"/>
           <w:sz w:val="25"/>
         </w:rPr>
-        <w:t>B.3 — Source of truth by metric</w:t>
+        <w:t>B.3 - Source of truth by metric</w:t>
       </w:r>
     </w:p>
     <w:tbl>
@@ -866,7 +864,7 @@
           <w:color w:val="23303B"/>
           <w:sz w:val="25"/>
         </w:rPr>
-        <w:t>B.4 — Reading iOS data under ATT / AdAttributionKit</w:t>
+        <w:t>B.4 - Reading iOS data under ATT / AdAttributionKit</w:t>
       </w:r>
     </w:p>
     <w:p>
@@ -874,7 +872,7 @@
         <w:pStyle w:val="ListBullet"/>
       </w:pPr>
       <w:r>
-        <w:t>ASA installs: AdServices deterministic attribution — reliable at keyword level even when ATT is declined.</w:t>
+        <w:t>ASA installs: AdServices deterministic attribution - reliable at keyword level even when ATT is declined.</w:t>
       </w:r>
     </w:p>
     <w:p>
@@ -890,7 +888,7 @@
         <w:pStyle w:val="ListBullet"/>
       </w:pPr>
       <w:r>
-        <w:t>Constraints: postback delay + windows (0–2 / 3–7 / 8–35 days), aggregation (no user-level), crowd-anonymity thresholds that null small sources. Keyword-level revenue is approximated with narrow, per-tool campaigns so campaign-level SKAN ≈ keyword-level — which the tool-CPP structure gives me for free.</w:t>
+        <w:t>Constraints: postback delay + windows (0-2 / 3-7 / 8-35 days), aggregation (no user-level), crowd-anonymity thresholds that null small sources. Keyword-level revenue is approximated with narrow, per-tool campaigns so campaign-level SKAN ≈ keyword-level - which the tool-CPP structure gives me for free.</w:t>
       </w:r>
     </w:p>
     <w:p>
@@ -909,7 +907,7 @@
           <w:color w:val="23303B"/>
           <w:sz w:val="25"/>
         </w:rPr>
-        <w:t>B.5 — Weekly report KPIs</w:t>
+        <w:t>B.5 - Weekly report KPIs</w:t>
       </w:r>
     </w:p>
     <w:p>
@@ -949,7 +947,7 @@
         <w:pStyle w:val="ListBullet"/>
       </w:pPr>
       <w:r>
-        <w:t>Installs — console vs MMP delta %</w:t>
+        <w:t>Installs - console vs MMP delta %</w:t>
       </w:r>
     </w:p>
     <w:p>
@@ -973,7 +971,7 @@
         <w:pStyle w:val="ListBullet"/>
       </w:pPr>
       <w:r>
-        <w:t>ROAS — D7 (leading) and D30 (gate)</w:t>
+        <w:t>ROAS - D7 (leading) and D30 (gate)</w:t>
       </w:r>
     </w:p>
     <w:p>
@@ -981,7 +979,7 @@
         <w:pStyle w:val="ListBullet"/>
       </w:pPr>
       <w:r>
-        <w:t>Organic rank on top tool terms (paid–organic sync)</w:t>
+        <w:t>Organic rank on top tool terms (paid-organic sync)</w:t>
       </w:r>
     </w:p>
     <w:p>

</xml_diff>